<commit_message>
Completed property sale contract
</commit_message>
<xml_diff>
--- a/contract_files/models/Contrato Compra e Venda de Imovel.docx
+++ b/contract_files/models/Contrato Compra e Venda de Imovel.docx
@@ -268,6 +268,7 @@
         <w:rPr>
           <w:sz w:val="22"/>
           <w:szCs w:val="22"/>
+          <w:highlight w:val="none"/>
           <w:lang w:val="pt-BR"/>
         </w:rPr>
       </w:pPr>
@@ -285,7 +286,7 @@
           <w:szCs w:val="22"/>
           <w:lang w:val="pt-BR"/>
         </w:rPr>
-        <w:t xml:space="preserve">________________, situado em ______________________________________________________________________________ Município: ____________________________, Estado: _____________________________, F</w:t>
+        <w:t xml:space="preserve">________________, situado em </w:t>
       </w:r>
       <w:r>
         <w:rPr>
@@ -293,7 +294,7 @@
           <w:szCs w:val="22"/>
           <w:lang w:val="pt-BR"/>
         </w:rPr>
-        <w:t xml:space="preserve">rente medindo ______ metros, confrontando com ____________________________________, Fundos: medindo ______ metros, confrontando com ___________________________________, Lado Direito: medindo ______ metros, confrontando com _______________________________, </w:t>
+        <w:t xml:space="preserve">______________________________________________________________________________, Complemento: _______________________, Bairro:___________________, CEP: ____________, </w:t>
       </w:r>
       <w:r>
         <w:rPr>
@@ -301,7 +302,23 @@
           <w:szCs w:val="22"/>
           <w:lang w:val="pt-BR"/>
         </w:rPr>
-        <w:t xml:space="preserve">Lado Esquerdo: medindo ______ metros, confrontando com _____________________________, </w:t>
+        <w:t xml:space="preserve">Município: ____________________________, Estado: _____________________________, f</w:t>
+      </w:r>
+      <w:r>
+        <w:rPr>
+          <w:sz w:val="22"/>
+          <w:szCs w:val="22"/>
+          <w:lang w:val="pt-BR"/>
+        </w:rPr>
+        <w:t xml:space="preserve">rente medindo ______ metros, confrontando com ____________________________________, fundos: medindo ______ metros, confrontando com ___________________________________, lado direito: medindo ______ metros, confrontando com _______________________________, </w:t>
+      </w:r>
+      <w:r>
+        <w:rPr>
+          <w:sz w:val="22"/>
+          <w:szCs w:val="22"/>
+          <w:lang w:val="pt-BR"/>
+        </w:rPr>
+        <w:t xml:space="preserve">lado esquerdo: medindo ______ metros, confrontando com _____________________________, </w:t>
       </w:r>
       <w:r>
         <w:rPr>
@@ -323,6 +340,120 @@
         <w:rPr>
           <w:sz w:val="22"/>
           <w:szCs w:val="22"/>
+          <w:highlight w:val="none"/>
+          <w:lang w:val="pt-BR"/>
+        </w:rPr>
+      </w:r>
+      <w:r>
+        <w:rPr>
+          <w:sz w:val="22"/>
+          <w:szCs w:val="22"/>
+          <w:highlight w:val="none"/>
+          <w:lang w:val="pt-BR"/>
+        </w:rPr>
+      </w:r>
+    </w:p>
+    <w:p>
+      <w:pPr>
+        <w:pBdr/>
+        <w:spacing w:line="276" w:lineRule="auto"/>
+        <w:ind w:left="-5"/>
+        <w:jc w:val="left"/>
+        <w:rPr>
+          <w:color w:val="000000" w:themeColor="text1"/>
+          <w:sz w:val="20"/>
+          <w:szCs w:val="20"/>
+          <w:highlight w:val="none"/>
+        </w:rPr>
+      </w:pPr>
+      <w:r>
+        <w:rPr>
+          <w:color w:val="000000" w:themeColor="text1"/>
+          <w:sz w:val="22"/>
+          <w:szCs w:val="22"/>
+          <w:highlight w:val="red"/>
+          <w:lang w:val="pt-BR"/>
+        </w:rPr>
+        <w:t xml:space="preserve">——- OPCIONAL PARA APAGAR ——-</w:t>
+      </w:r>
+      <w:r>
+        <w:rPr>
+          <w:color w:val="000000" w:themeColor="text1"/>
+          <w:sz w:val="20"/>
+          <w:szCs w:val="20"/>
+          <w:highlight w:val="none"/>
+        </w:rPr>
+      </w:r>
+      <w:r>
+        <w:rPr>
+          <w:color w:val="000000" w:themeColor="text1"/>
+          <w:sz w:val="20"/>
+          <w:szCs w:val="20"/>
+          <w:highlight w:val="none"/>
+        </w:rPr>
+      </w:r>
+    </w:p>
+    <w:p>
+      <w:pPr>
+        <w:pBdr/>
+        <w:spacing w:line="276" w:lineRule="auto"/>
+        <w:ind w:left="-5"/>
+        <w:jc w:val="left"/>
+        <w:rPr>
+          <w:b/>
+          <w:bCs/>
+          <w:sz w:val="22"/>
+          <w:szCs w:val="22"/>
+          <w:lang w:val="pt-BR"/>
+        </w:rPr>
+      </w:pPr>
+      <w:r>
+        <w:rPr>
+          <w:b/>
+          <w:bCs/>
+          <w:sz w:val="22"/>
+          <w:szCs w:val="22"/>
+          <w:lang w:val="pt-BR"/>
+        </w:rPr>
+        <w:t xml:space="preserve">CLÁUSULA PRIMEIRA - DO OBJETO</w:t>
+      </w:r>
+      <w:r>
+        <w:rPr>
+          <w:b/>
+          <w:bCs/>
+          <w:sz w:val="22"/>
+          <w:szCs w:val="22"/>
+          <w:lang w:val="pt-BR"/>
+        </w:rPr>
+      </w:r>
+      <w:r>
+        <w:rPr>
+          <w:b/>
+          <w:bCs/>
+          <w:sz w:val="22"/>
+          <w:szCs w:val="22"/>
+          <w:lang w:val="pt-BR"/>
+        </w:rPr>
+      </w:r>
+    </w:p>
+    <w:p>
+      <w:pPr>
+        <w:pBdr/>
+        <w:spacing w:line="276" w:lineRule="auto"/>
+        <w:ind w:left="-5"/>
+        <w:jc w:val="left"/>
+        <w:rPr>
+          <w:sz w:val="22"/>
+          <w:szCs w:val="22"/>
+          <w:lang w:val="pt-BR"/>
+        </w:rPr>
+      </w:pPr>
+      <w:r>
+        <w:rPr>
+          <w:b/>
+          <w:bCs/>
+          <w:sz w:val="22"/>
+          <w:szCs w:val="22"/>
           <w:lang w:val="pt-BR"/>
         </w:rPr>
       </w:r>
@@ -332,20 +463,266 @@
           <w:szCs w:val="22"/>
           <w:lang w:val="pt-BR"/>
         </w:rPr>
+        <w:t xml:space="preserve">O(A) VENDEDOR(A)/CEDENTE declara exercer legitimamente a posse e deter direitos possessórios sobre  ______ (_________), tipo: ______________</w:t>
       </w:r>
-    </w:p>
-    <w:p>
-      <w:pPr>
-        <w:pBdr/>
-        <w:spacing w:line="276" w:lineRule="auto"/>
-        <w:ind w:left="-5"/>
-        <w:jc w:val="left"/>
+      <w:r>
         <w:rPr>
           <w:sz w:val="22"/>
           <w:szCs w:val="22"/>
           <w:lang w:val="pt-BR"/>
         </w:rPr>
-      </w:pPr>
+        <w:t xml:space="preserve">________________, situado em ______________________________________________________________________________, Complemento: _______________________, Bairro:___________________, CEP: ____________, </w:t>
+      </w:r>
+      <w:r>
+        <w:rPr>
+          <w:sz w:val="22"/>
+          <w:szCs w:val="22"/>
+          <w:lang w:val="pt-BR"/>
+        </w:rPr>
+        <w:t xml:space="preserve">Município: _________________________________, Estado: _____________________________, </w:t>
+      </w:r>
+      <w:r>
+        <w:rPr>
+          <w:sz w:val="22"/>
+          <w:szCs w:val="22"/>
+          <w:lang w:val="pt-BR"/>
+        </w:rPr>
+        <w:t xml:space="preserve">com área construída de ______________ m² </w:t>
+      </w:r>
+      <w:r>
+        <w:rPr>
+          <w:sz w:val="22"/>
+          <w:szCs w:val="22"/>
+          <w:lang w:val="pt-BR"/>
+        </w:rPr>
+        <w:t xml:space="preserve">(___________________________________), </w:t>
+      </w:r>
+      <w:r/>
+      <w:r>
+        <w:rPr>
+          <w:sz w:val="22"/>
+          <w:szCs w:val="22"/>
+          <w:lang w:val="pt-BR"/>
+        </w:rPr>
+        <w:t xml:space="preserve"> com </w:t>
+      </w:r>
+      <w:r>
+        <w:rPr>
+          <w:sz w:val="22"/>
+          <w:szCs w:val="22"/>
+          <w:lang w:val="pt-BR"/>
+        </w:rPr>
+        <w:t xml:space="preserve">frente medindo ______ metros, </w:t>
+      </w:r>
+      <w:r>
+        <w:rPr>
+          <w:sz w:val="22"/>
+          <w:szCs w:val="22"/>
+          <w:lang w:val="pt-BR"/>
+        </w:rPr>
+        <w:t xml:space="preserve">fundos</w:t>
+      </w:r>
+      <w:r>
+        <w:rPr>
+          <w:sz w:val="22"/>
+          <w:szCs w:val="22"/>
+          <w:lang w:val="pt-BR"/>
+        </w:rPr>
+        <w:t xml:space="preserve"> </w:t>
+      </w:r>
+      <w:r>
+        <w:rPr>
+          <w:sz w:val="22"/>
+          <w:szCs w:val="22"/>
+          <w:lang w:val="pt-BR"/>
+        </w:rPr>
+        <w:t xml:space="preserve">medindo ______ metros,</w:t>
+      </w:r>
+      <w:r/>
+      <w:r>
+        <w:rPr>
+          <w:sz w:val="22"/>
+          <w:szCs w:val="22"/>
+          <w:lang w:val="pt-BR"/>
+        </w:rPr>
+        <w:t xml:space="preserve"> </w:t>
+      </w:r>
+      <w:r>
+        <w:rPr>
+          <w:sz w:val="22"/>
+          <w:szCs w:val="22"/>
+          <w:lang w:val="pt-BR"/>
+        </w:rPr>
+        <w:t xml:space="preserve">lado direito</w:t>
+      </w:r>
+      <w:r>
+        <w:rPr>
+          <w:sz w:val="22"/>
+          <w:szCs w:val="22"/>
+          <w:lang w:val="pt-BR"/>
+        </w:rPr>
+        <w:t xml:space="preserve"> medindo ______ metros,</w:t>
+      </w:r>
+      <w:r/>
+      <w:r>
+        <w:rPr>
+          <w:sz w:val="22"/>
+          <w:szCs w:val="22"/>
+          <w:lang w:val="pt-BR"/>
+        </w:rPr>
+        <w:t xml:space="preserve"> </w:t>
+      </w:r>
+      <w:r>
+        <w:rPr>
+          <w:sz w:val="22"/>
+          <w:szCs w:val="22"/>
+          <w:lang w:val="pt-BR"/>
+        </w:rPr>
+        <w:t xml:space="preserve">lado esquerdo medindo ______ metros.</w:t>
+      </w:r>
+      <w:r>
+        <w:rPr>
+          <w:b/>
+          <w:bCs/>
+          <w:sz w:val="22"/>
+          <w:szCs w:val="22"/>
+          <w:lang w:val="pt-BR"/>
+        </w:rPr>
+      </w:r>
+    </w:p>
+    <w:p>
+      <w:pPr>
+        <w:pBdr/>
+        <w:spacing w:line="276" w:lineRule="auto"/>
+        <w:ind w:left="-5"/>
+        <w:jc w:val="left"/>
+        <w:rPr>
+          <w:b/>
+          <w:bCs/>
+          <w:sz w:val="22"/>
+          <w:szCs w:val="22"/>
+          <w:lang w:val="pt-BR"/>
+        </w:rPr>
+      </w:pPr>
+      <w:r>
+        <w:rPr>
+          <w:sz w:val="22"/>
+          <w:szCs w:val="22"/>
+          <w:lang w:val="pt-BR"/>
+        </w:rPr>
+      </w:r>
+      <w:r>
+        <w:rPr>
+          <w:sz w:val="22"/>
+          <w:szCs w:val="22"/>
+          <w:lang w:val="pt-BR"/>
+        </w:rPr>
+        <w:t xml:space="preserve">Edificada sobre terreno com área total de __________ m² (_____________________________), </w:t>
+      </w:r>
+      <w:r>
+        <w:rPr>
+          <w:sz w:val="22"/>
+          <w:szCs w:val="22"/>
+          <w:lang w:val="pt-BR"/>
+        </w:rPr>
+        <w:t xml:space="preserve">frente </w:t>
+      </w:r>
+      <w:r>
+        <w:rPr>
+          <w:sz w:val="22"/>
+          <w:szCs w:val="22"/>
+          <w:lang w:val="pt-BR"/>
+        </w:rPr>
+        <w:t xml:space="preserve">medindo ______ metros, confrontando com ____________________________________, fundos medindo ______ metros, confrontando com ___________________________________, lado direito: medindo ______ metros, confrontando com _______________________________, </w:t>
+      </w:r>
+      <w:r>
+        <w:rPr>
+          <w:sz w:val="22"/>
+          <w:szCs w:val="22"/>
+          <w:lang w:val="pt-BR"/>
+        </w:rPr>
+        <w:t xml:space="preserve">lado esquerdo: medindo ______ metros, confrontando com _____________________________, </w:t>
+      </w:r>
+      <w:r>
+        <w:rPr>
+          <w:sz w:val="22"/>
+          <w:szCs w:val="22"/>
+          <w:lang w:val="pt-BR"/>
+        </w:rPr>
+        <w:t xml:space="preserve">com as seguintes características: ___________________________________________________ </w:t>
+      </w:r>
+      <w:r>
+        <w:rPr>
+          <w:sz w:val="22"/>
+          <w:szCs w:val="22"/>
+          <w:lang w:val="pt-BR"/>
+        </w:rPr>
+        <w:t xml:space="preserve">______________________________________________________________________________,</w:t>
+      </w:r>
+      <w:r>
+        <w:rPr>
+          <w:b/>
+          <w:bCs/>
+          <w:sz w:val="22"/>
+          <w:szCs w:val="22"/>
+          <w:lang w:val="pt-BR"/>
+        </w:rPr>
+      </w:r>
+      <w:r/>
+    </w:p>
+    <w:p>
+      <w:pPr>
+        <w:pBdr/>
+        <w:spacing w:line="276" w:lineRule="auto"/>
+        <w:ind w:left="-5"/>
+        <w:jc w:val="left"/>
+        <w:rPr>
+          <w:sz w:val="20"/>
+          <w:szCs w:val="24"/>
+          <w:highlight w:val="red"/>
+        </w:rPr>
+      </w:pPr>
+      <w:r>
+        <w:rPr>
+          <w:sz w:val="22"/>
+          <w:szCs w:val="22"/>
+          <w:highlight w:val="red"/>
+          <w:lang w:val="pt-BR"/>
+        </w:rPr>
+        <w:t xml:space="preserve">——- FIM OPCIONAL PARA APAGAR ——-</w:t>
+      </w:r>
+      <w:r>
+        <w:rPr>
+          <w:sz w:val="20"/>
+          <w:szCs w:val="24"/>
+          <w:highlight w:val="red"/>
+        </w:rPr>
+      </w:r>
+      <w:r>
+        <w:rPr>
+          <w:sz w:val="20"/>
+          <w:szCs w:val="24"/>
+          <w:highlight w:val="red"/>
+        </w:rPr>
+      </w:r>
+    </w:p>
+    <w:p>
+      <w:pPr>
+        <w:pBdr/>
+        <w:spacing w:line="276" w:lineRule="auto"/>
+        <w:ind w:left="-5"/>
+        <w:jc w:val="left"/>
+        <w:rPr>
+          <w:highlight w:val="none"/>
+          <w:lang w:val="pt-BR" w:bidi="pt-BR"/>
+        </w:rPr>
+      </w:pPr>
+      <w:r>
+        <w:rPr>
+          <w:highlight w:val="none"/>
+          <w:lang w:val="pt-BR" w:bidi="pt-BR"/>
+        </w:rPr>
+      </w:r>
       <w:r>
         <w:rPr>
           <w:b/>
@@ -373,16 +750,14 @@
       </w:r>
       <w:r>
         <w:rPr>
-          <w:sz w:val="22"/>
-          <w:szCs w:val="22"/>
-          <w:lang w:val="pt-BR"/>
+          <w:highlight w:val="none"/>
+          <w:lang w:val="pt-BR" w:bidi="pt-BR"/>
         </w:rPr>
       </w:r>
       <w:r>
         <w:rPr>
-          <w:sz w:val="22"/>
-          <w:szCs w:val="22"/>
-          <w:lang w:val="pt-BR"/>
+          <w:highlight w:val="none"/>
+          <w:lang w:val="pt-BR" w:bidi="pt-BR"/>
         </w:rPr>
       </w:r>
     </w:p>
@@ -986,13 +1361,6 @@
           <w:lang w:val="pt-BR"/>
         </w:rPr>
         <w:t xml:space="preserve">CLÁUSULA SEXTA - DA RESPONSABILIDADE </w:t>
-      </w:r>
-      <w:r>
-        <w:rPr>
-          <w:sz w:val="22"/>
-          <w:szCs w:val="22"/>
-          <w:lang w:val="pt-BR"/>
-        </w:rPr>
       </w:r>
       <w:r>
         <w:rPr>
@@ -3367,7 +3735,7 @@
         <w:rFonts w:hint="default" w:asciiTheme="minorHAnsi" w:hAnsiTheme="minorHAnsi" w:eastAsiaTheme="minorEastAsia" w:cstheme="minorBidi"/>
         <w:sz w:val="24"/>
         <w:szCs w:val="24"/>
-        <w:lang w:val="en-US" w:eastAsia="en-US" w:bidi="ar-SA"/>
+        <w:lang w:val="pt-BR" w:eastAsia="en-US" w:bidi="ar-SA"/>
         <w14:ligatures w14:val="standardContextual"/>
       </w:rPr>
     </w:rPrDefault>

</xml_diff>